<commit_message>
feat: manual edit validation subsystem with windowed/period-wide rule scope (Sprint 2 Day 9)
Implement SDD 5.5 (v1.3) degisikligi_dogrula: DogrulamaServisi validates
a single-cell assignment change against a ±7-day window for mandatory
rules (fast accept/reject) and against the full period for S2/S3/S4,
whose fairness/hours-balance formulas depend on period-wide aggregates
and would silently invert sign under window-only evaluation. Each rule
now carries a fixed kapsam (PENCERE/DONEM_GENELI) driving which
assignment set feeds its dogrula() call. Add POST /api/atama/dogrula
and PUT /api/atama, the latter persisting accepted changes with
kaynak=MANUEL and rejecting mandatory-rule violations with 409.

Sync docs/SDD.docx to v1.3 (5.5 rewritten with the kapsam split).
</commit_message>
<xml_diff>
--- a/docs/BOTAS_Vardiya_Cizelgeleme_SDD.docx
+++ b/docs/BOTAS_Vardiya_Cizelgeleme_SDD.docx
@@ -641,6 +641,108 @@
           </w:p>
         </w:tc>
       </w:tr>
+      <w:tr>
+        <w:tc>
+          <w:tcPr>
+            <w:tcW w:type="dxa" w:w="2200"/>
+            <w:tcMar>
+              <w:top w:type="dxa" w:w="60"/>
+              <w:left w:type="dxa" w:w="100"/>
+              <w:bottom w:type="dxa" w:w="60"/>
+              <w:right w:type="dxa" w:w="100"/>
+            </w:tcMar>
+          </w:tcPr>
+          <w:p>
+            <w:pPr>
+              <w:spacing w:after="0" w:line="240"/>
+            </w:pPr>
+            <w:r>
+              <w:rPr>
+                <w:b w:val="false"/>
+                <w:bCs w:val="false"/>
+                <w:sz w:val="18"/>
+                <w:szCs w:val="18"/>
+              </w:rPr>
+              <w:t xml:space="preserve">Ömer HARMANKAYA</w:t>
+            </w:r>
+          </w:p>
+        </w:tc>
+        <w:tc>
+          <w:tcPr>
+            <w:tcW w:type="dxa" w:w="1300"/>
+            <w:tcMar>
+              <w:top w:type="dxa" w:w="60"/>
+              <w:left w:type="dxa" w:w="100"/>
+              <w:bottom w:type="dxa" w:w="60"/>
+              <w:right w:type="dxa" w:w="100"/>
+            </w:tcMar>
+          </w:tcPr>
+          <w:p>
+            <w:pPr>
+              <w:spacing w:after="0" w:line="240"/>
+            </w:pPr>
+            <w:r>
+              <w:rPr>
+                <w:b w:val="false"/>
+                <w:bCs w:val="false"/>
+                <w:sz w:val="18"/>
+                <w:szCs w:val="18"/>
+              </w:rPr>
+              <w:t xml:space="preserve">06.08.2026</w:t>
+            </w:r>
+          </w:p>
+        </w:tc>
+        <w:tc>
+          <w:tcPr>
+            <w:tcW w:type="dxa" w:w="4300"/>
+            <w:tcMar>
+              <w:top w:type="dxa" w:w="60"/>
+              <w:left w:type="dxa" w:w="100"/>
+              <w:bottom w:type="dxa" w:w="60"/>
+              <w:right w:type="dxa" w:w="100"/>
+            </w:tcMar>
+          </w:tcPr>
+          <w:p>
+            <w:pPr>
+              <w:spacing w:after="0" w:line="240"/>
+            </w:pPr>
+            <w:r>
+              <w:rPr>
+                <w:b w:val="false"/>
+                <w:bCs w:val="false"/>
+                <w:sz w:val="18"/>
+                <w:szCs w:val="18"/>
+              </w:rPr>
+              <w:t xml:space="preserve">5.5'teki manuel düzenleme doğrulaması düzeltildi: dönem geneli agregasyona dayanan esnek hedefler (S2-S4) artık pencere yerine dönem geneli atama kümesiyle değerlendiriliyor; kural başına kapsam alanı (pencere / dönem geneli) tanımlandı</w:t>
+            </w:r>
+          </w:p>
+        </w:tc>
+        <w:tc>
+          <w:tcPr>
+            <w:tcW w:type="dxa" w:w="1200"/>
+            <w:tcMar>
+              <w:top w:type="dxa" w:w="60"/>
+              <w:left w:type="dxa" w:w="100"/>
+              <w:bottom w:type="dxa" w:w="60"/>
+              <w:right w:type="dxa" w:w="100"/>
+            </w:tcMar>
+          </w:tcPr>
+          <w:p>
+            <w:pPr>
+              <w:spacing w:after="0" w:line="240"/>
+            </w:pPr>
+            <w:r>
+              <w:rPr>
+                <w:b w:val="false"/>
+                <w:bCs w:val="false"/>
+                <w:sz w:val="18"/>
+                <w:szCs w:val="18"/>
+              </w:rPr>
+              <w:t xml:space="preserve">1.3</w:t>
+            </w:r>
+          </w:p>
+        </w:tc>
+      </w:tr>
     </w:tbl>
     <w:p>
       <w:pPr>
@@ -14083,7 +14185,31 @@
           <w:sz w:val="22"/>
           <w:szCs w:val="22"/>
         </w:rPr>
-        <w:t xml:space="preserve">Yönetici bir atamayı değiştirdiğinde, sistemin bir saniyenin altında kural ihlali bildirmesi beklenir. Bütün kuralların bütün dönem için yeniden değerlendirilmesi bu hedefi karşılamaz; bu nedenle doğrulama, değişiklikten etkilenen zaman penceresiyle sınırlandırılır.</w:t>
+        <w:t xml:space="preserve">Yönetici bir atamayı değiştirdiğinde, sistemin bir saniyenin altında kural ihlali bildirmesi beklenir. Bütün kuralların bütün dönem için sıfırdan yeniden değerlendirilmesi bu hedefi karşılamaz; bu nedenle doğrulama iki farklı kapsamda yürütülür ve kuralın kendi tanımına göre doğru kapsam seçilir.</w:t>
+      </w:r>
+    </w:p>
+    <w:p>
+      <w:pPr>
+        <w:spacing w:after="120" w:line="300"/>
+      </w:pPr>
+      <w:r>
+        <w:rPr>
+          <w:sz w:val="22"/>
+          <w:szCs w:val="22"/>
+        </w:rPr>
+        <w:t xml:space="preserve">Zorunlu kısıtların (H1–H8) tamamı doğası gereği yereldir — en geniş kapsamlısı olan kayan yedi günlük saat tavanı bile yalnızca yedi günlük bir pencereye bakar. Bu kurallar için değiştirilen günün yedi gün öncesi ve yedi gün sonrasından oluşan pencere yeterlidir; pencere dışındaki atamalar kuralın sonucunu hiçbir zaman etkilemez.</w:t>
+      </w:r>
+    </w:p>
+    <w:p>
+      <w:pPr>
+        <w:spacing w:after="120" w:line="300"/>
+      </w:pPr>
+      <w:r>
+        <w:rPr>
+          <w:sz w:val="22"/>
+          <w:szCs w:val="22"/>
+        </w:rPr>
+        <w:t xml:space="preserve">Esnek hedeflerin (S1–S8) bir kısmı ise dönem geneline yayılan bir toplam veya bir agregasyon üzerine kuruludur ve pencereyle sınırlandırılamaz. S1'in kapsama açığı her (gün, vardiya, nokta) hücresini kendi talebine göre değerlendirir; bir hücrelik değişikliğin S1 cezasına etkisi yalnızca o hücreye bakılarak hesaplanabilir ve bu doğası gereği zaten yereldir. S2, S3 ve S4 ise dönem genelindeki en yüksek ve en düşük değere (adalet) veya kişinin dönem toplamına (saat dengesi) bakar; bir kişinin tek bir gününün değişmesi bu agregatı kaydırabileceğinden, doğru bir ceza farkı ancak ilgili kişi veya dönem genelindeki mevcut değerle karşılaştırılarak hesaplanabilir. Bu nedenle S2–S4'ün ceza_degisimi hesabı, pencere yerine dönem genelindeki atama kümesi üzerinden, değişiklik öncesi ve sonrası olmak üzere iki kez çalıştırılır.</w:t>
       </w:r>
     </w:p>
     <w:p>
@@ -14139,7 +14265,7 @@
           <w:sz w:val="18"/>
           <w:szCs w:val="18"/>
         </w:rPr>
-        <w:t xml:space="preserve">    atamalar ← AtamaDeposu.getir(surum_id, pencere)</w:t>
+        <w:t xml:space="preserve">    atamalar_pencere ← AtamaDeposu.getir(surum_id, pencere)</w:t>
       </w:r>
     </w:p>
     <w:p>
@@ -14153,7 +14279,7 @@
           <w:sz w:val="18"/>
           <w:szCs w:val="18"/>
         </w:rPr>
-        <w:t xml:space="preserve">               UYGULA degisiklik</w:t>
+        <w:t xml:space="preserve">                       UYGULA degisiklik</w:t>
       </w:r>
     </w:p>
     <w:p>
@@ -14167,7 +14293,7 @@
           <w:sz w:val="18"/>
           <w:szCs w:val="18"/>
         </w:rPr>
-        <w:t xml:space="preserve"/>
+        <w:t xml:space="preserve">    atamalar_donem ← AtamaDeposu.getir(surum_id, TÜM_DÖNEM)</w:t>
       </w:r>
     </w:p>
     <w:p>
@@ -14181,7 +14307,7 @@
           <w:sz w:val="18"/>
           <w:szCs w:val="18"/>
         </w:rPr>
-        <w:t xml:space="preserve">    ihlaller ← []</w:t>
+        <w:t xml:space="preserve">                     UYGULA degisiklik</w:t>
       </w:r>
     </w:p>
     <w:p>
@@ -14195,7 +14321,7 @@
           <w:sz w:val="18"/>
           <w:szCs w:val="18"/>
         </w:rPr>
-        <w:t xml:space="preserve">    HER kural İÇİN kurallar:</w:t>
+        <w:t xml:space="preserve"/>
       </w:r>
     </w:p>
     <w:p>
@@ -14209,7 +14335,7 @@
           <w:sz w:val="18"/>
           <w:szCs w:val="18"/>
         </w:rPr>
-        <w:t xml:space="preserve">        ihlaller.EKLE_HEPSİNİ(kural.dogrula(atamalar, baglam))</w:t>
+        <w:t xml:space="preserve">    ihlaller ← []</w:t>
       </w:r>
     </w:p>
     <w:p>
@@ -14223,7 +14349,7 @@
           <w:sz w:val="18"/>
           <w:szCs w:val="18"/>
         </w:rPr>
-        <w:t xml:space="preserve"/>
+        <w:t xml:space="preserve">    HER kural İÇİN kurallar:</w:t>
       </w:r>
     </w:p>
     <w:p>
@@ -14237,7 +14363,7 @@
           <w:sz w:val="18"/>
           <w:szCs w:val="18"/>
         </w:rPr>
-        <w:t xml:space="preserve">    zorunlu ← ihlaller.SÜZ(tip = ZORUNLU)</w:t>
+        <w:t xml:space="preserve">        atamalar ← EĞER kural.kapsam = DÖNEM_GENELİ</w:t>
       </w:r>
     </w:p>
     <w:p>
@@ -14251,7 +14377,7 @@
           <w:sz w:val="18"/>
           <w:szCs w:val="18"/>
         </w:rPr>
-        <w:t xml:space="preserve">    esnek   ← ihlaller.SÜZ(tip = ESNEK)</w:t>
+        <w:t xml:space="preserve">                   İSE atamalar_donem DEĞİLSE atamalar_pencere</w:t>
       </w:r>
     </w:p>
     <w:p>
@@ -14265,7 +14391,7 @@
           <w:sz w:val="18"/>
           <w:szCs w:val="18"/>
         </w:rPr>
-        <w:t xml:space="preserve">    DÖNDÜR DogrulamaSonucu(</w:t>
+        <w:t xml:space="preserve">        ihlaller.EKLE_HEPSİNİ(kural.dogrula(atamalar, baglam))</w:t>
       </w:r>
     </w:p>
     <w:p>
@@ -14279,7 +14405,7 @@
           <w:sz w:val="18"/>
           <w:szCs w:val="18"/>
         </w:rPr>
-        <w:t xml:space="preserve">        kabul_edilebilir = zorunlu.BOŞ_MU(),</w:t>
+        <w:t xml:space="preserve"/>
       </w:r>
     </w:p>
     <w:p>
@@ -14293,7 +14419,7 @@
           <w:sz w:val="18"/>
           <w:szCs w:val="18"/>
         </w:rPr>
-        <w:t xml:space="preserve">        zorunlu_ihlaller = zorunlu,</w:t>
+        <w:t xml:space="preserve">    zorunlu ← ihlaller.SÜZ(tip = ZORUNLU)</w:t>
       </w:r>
     </w:p>
     <w:p>
@@ -14307,6 +14433,62 @@
           <w:sz w:val="18"/>
           <w:szCs w:val="18"/>
         </w:rPr>
+        <w:t xml:space="preserve">    esnek   ← ihlaller.SÜZ(tip = ESNEK)</w:t>
+      </w:r>
+    </w:p>
+    <w:p>
+      <w:pPr>
+        <w:spacing w:after="0" w:line="260"/>
+        <w:ind w:left="300"/>
+      </w:pPr>
+      <w:r>
+        <w:rPr>
+          <w:rFonts w:ascii="Consolas" w:cs="Consolas" w:eastAsia="Consolas" w:hAnsi="Consolas"/>
+          <w:sz w:val="18"/>
+          <w:szCs w:val="18"/>
+        </w:rPr>
+        <w:t xml:space="preserve">    DÖNDÜR DogrulamaSonucu(</w:t>
+      </w:r>
+    </w:p>
+    <w:p>
+      <w:pPr>
+        <w:spacing w:after="0" w:line="260"/>
+        <w:ind w:left="300"/>
+      </w:pPr>
+      <w:r>
+        <w:rPr>
+          <w:rFonts w:ascii="Consolas" w:cs="Consolas" w:eastAsia="Consolas" w:hAnsi="Consolas"/>
+          <w:sz w:val="18"/>
+          <w:szCs w:val="18"/>
+        </w:rPr>
+        <w:t xml:space="preserve">        kabul_edilebilir = zorunlu.BOŞ_MU(),</w:t>
+      </w:r>
+    </w:p>
+    <w:p>
+      <w:pPr>
+        <w:spacing w:after="0" w:line="260"/>
+        <w:ind w:left="300"/>
+      </w:pPr>
+      <w:r>
+        <w:rPr>
+          <w:rFonts w:ascii="Consolas" w:cs="Consolas" w:eastAsia="Consolas" w:hAnsi="Consolas"/>
+          <w:sz w:val="18"/>
+          <w:szCs w:val="18"/>
+        </w:rPr>
+        <w:t xml:space="preserve">        zorunlu_ihlaller = zorunlu,</w:t>
+      </w:r>
+    </w:p>
+    <w:p>
+      <w:pPr>
+        <w:spacing w:after="0" w:line="260"/>
+        <w:ind w:left="300"/>
+      </w:pPr>
+      <w:r>
+        <w:rPr>
+          <w:rFonts w:ascii="Consolas" w:cs="Consolas" w:eastAsia="Consolas" w:hAnsi="Consolas"/>
+          <w:sz w:val="18"/>
+          <w:szCs w:val="18"/>
+        </w:rPr>
         <w:t xml:space="preserve">        ceza_degisimi    = esnek.ceza_farki())</w:t>
       </w:r>
     </w:p>
@@ -14324,14 +14506,14 @@
     </w:p>
     <w:p>
       <w:pPr>
-        <w:spacing w:after="120" w:line="300"/>
+        <w:spacing w:after="160" w:line="300"/>
       </w:pPr>
       <w:r>
         <w:rPr>
           <w:sz w:val="22"/>
           <w:szCs w:val="22"/>
         </w:rPr>
-        <w:t xml:space="preserve">Etkilenen pencere, kuralların zaman kapsamından türetilir. Kayan yedi günlük saat tavanı en geniş kapsamlı kural olduğundan, değiştirilen günün yedi gün öncesi ve yedi gün sonrası incelenir. Bu, tipik bir dönemde iki yüz kadar atamanın değerlendirilmesi anlamına gelir ve hedeflenen sürenin belirgin altında kalır.</w:t>
+        <w:t xml:space="preserve">Kural sınıfının kapsam alanı sabittir ve kural tanımından gelir; çalışma zamanında hesaplanmaz. H1–H8 ile S1, S5, S6, S6b, S7 ve S8 pencere kapsamındadır — S1 ve S8'in kendisi dönem genelinde tanımlı olsa da, bir tek hücrelik değişikliğin bu iki kural üzerindeki etkisi yalnızca o hücreye bakılarak hesaplanabildiğinden pencere yeterlidir. S2, S3 ve S4 dönem geneli kapsamındadır. Dönem genelindeki atama sayısı tipik bir örnekte (kırk personel, yirmi sekiz gün) bin iki yüz satır civarındadır; bu ölçekte iki kez tarama milisaniyeler sürer ve hedeflenen sürenin belirgin altında kalır.</w:t>
       </w:r>
     </w:p>
     <w:p>

</xml_diff>